<commit_message>
Just updated my resume
</commit_message>
<xml_diff>
--- a/assets/Mmadubugwu_Kingsley_CV.docx
+++ b/assets/Mmadubugwu_Kingsley_CV.docx
@@ -572,6 +572,104 @@
           <w:szCs w:val="20"/>
         </w:rPr>
         <w:t xml:space="preserve">Containerised the application using Docker for portable deployment; built with Python, FastAPI, SQLite, and SMTP.</w:t>
+      </w:r>
+    </w:p>
+    <w:p>
+      <w:pPr>
+        <w:tabs>
+          <w:tab w:val="right" w:pos="9360"/>
+        </w:tabs>
+        <w:spacing w:after="20" w:before="80"/>
+      </w:pPr>
+      <w:r>
+        <w:rPr>
+          <w:rFonts w:ascii="Times New Roman" w:cs="Times New Roman" w:eastAsia="Times New Roman" w:hAnsi="Times New Roman"/>
+          <w:b/>
+          <w:bCs/>
+          <w:sz w:val="20"/>
+          <w:szCs w:val="20"/>
+        </w:rPr>
+        <w:t xml:space="preserve">Small Office Network Design</w:t>
+      </w:r>
+      <w:r>
+        <w:rPr>
+          <w:rFonts w:ascii="Times New Roman" w:cs="Times New Roman" w:eastAsia="Times New Roman" w:hAnsi="Times New Roman"/>
+          <w:sz w:val="20"/>
+          <w:szCs w:val="20"/>
+        </w:rPr>
+        <w:t xml:space="preserve">  |  Cisco Packet Tracer	github.com/Kmmadu/Small-Office-Network-Design</w:t>
+      </w:r>
+    </w:p>
+    <w:p>
+      <w:pPr>
+        <w:pStyle w:val="ListParagraph"/>
+        <w:numPr>
+          <w:ilvl w:val="0"/>
+          <w:numId w:val="2"/>
+        </w:numPr>
+        <w:spacing w:after="20" w:before="20"/>
+      </w:pPr>
+      <w:r>
+        <w:rPr>
+          <w:rFonts w:ascii="Times New Roman" w:cs="Times New Roman" w:eastAsia="Times New Roman" w:hAnsi="Times New Roman"/>
+          <w:sz w:val="20"/>
+          <w:szCs w:val="20"/>
+        </w:rPr>
+        <w:t xml:space="preserve">Designed and simulated a complete small office network supporting 3 departments and 50+ users using Cisco Packet Tracer.</w:t>
+      </w:r>
+    </w:p>
+    <w:p>
+      <w:pPr>
+        <w:pStyle w:val="ListParagraph"/>
+        <w:numPr>
+          <w:ilvl w:val="0"/>
+          <w:numId w:val="2"/>
+        </w:numPr>
+        <w:spacing w:after="20" w:before="20"/>
+      </w:pPr>
+      <w:r>
+        <w:rPr>
+          <w:rFonts w:ascii="Times New Roman" w:cs="Times New Roman" w:eastAsia="Times New Roman" w:hAnsi="Times New Roman"/>
+          <w:sz w:val="20"/>
+          <w:szCs w:val="20"/>
+        </w:rPr>
+        <w:t xml:space="preserve">Implemented VLAN segmentation (VLAN 10 – Sales, VLAN 20 – Engineering, VLAN 30 – HR) with 802.1Q trunking for inter-switch communication.</w:t>
+      </w:r>
+    </w:p>
+    <w:p>
+      <w:pPr>
+        <w:pStyle w:val="ListParagraph"/>
+        <w:numPr>
+          <w:ilvl w:val="0"/>
+          <w:numId w:val="2"/>
+        </w:numPr>
+        <w:spacing w:after="20" w:before="20"/>
+      </w:pPr>
+      <w:r>
+        <w:rPr>
+          <w:rFonts w:ascii="Times New Roman" w:cs="Times New Roman" w:eastAsia="Times New Roman" w:hAnsi="Times New Roman"/>
+          <w:sz w:val="20"/>
+          <w:szCs w:val="20"/>
+        </w:rPr>
+        <w:t xml:space="preserve">Configured router-on-a-stick for inter-VLAN routing with dedicated DHCP scopes per VLAN.</w:t>
+      </w:r>
+    </w:p>
+    <w:p>
+      <w:pPr>
+        <w:pStyle w:val="ListParagraph"/>
+        <w:numPr>
+          <w:ilvl w:val="0"/>
+          <w:numId w:val="2"/>
+        </w:numPr>
+        <w:spacing w:after="20" w:before="20"/>
+      </w:pPr>
+      <w:r>
+        <w:rPr>
+          <w:rFonts w:ascii="Times New Roman" w:cs="Times New Roman" w:eastAsia="Times New Roman" w:hAnsi="Times New Roman"/>
+          <w:sz w:val="20"/>
+          <w:szCs w:val="20"/>
+        </w:rPr>
+        <w:t xml:space="preserve">Deployed NAT overload (PAT) for shared internet access and static NAT for an internal web server; established WAN connectivity between two simulated office locations.</w:t>
       </w:r>
     </w:p>
     <w:p>

</xml_diff>